<commit_message>
docs: consolidar resultados y actualizar el informe de DBSCAN
</commit_message>
<xml_diff>
--- a/docs/resultados/experiencia-dbscan.docx
+++ b/docs/resultados/experiencia-dbscan.docx
@@ -481,6 +481,32 @@
       </w:r>
     </w:p>
     <w:p>
+      <w:pPr>
+        <w:pStyle w:val="Heading1"/>
+      </w:pPr>
+      <w:r>
+        <w:t>4 Cómo determina DBSCAN la cercanía y los grupos</w:t>
+      </w:r>
+    </w:p>
+    <w:p>
+      <w:pPr/>
+      <w:r>
+        <w:t>Cada alumno se representa como un punto en un espacio matemático de diez dimensiones: una coordenada por atributo académico. Antes de comparar alumnos, estandarizamos cada atributo restando su media y dividiendo por su desvío muestral. Así, los días y los conteos se expresan en una escala comparable.</w:t>
+      </w:r>
+    </w:p>
+    <w:p>
+      <w:pPr/>
+      <w:r>
+        <w:t>La cercanía se calcula con distancia euclídea: para dos alumnos, se restan sus valores estandarizados en cada uno de los diez atributos, se elevan esas diferencias al cuadrado, se suman y se toma la raíz cuadrada. Son vecinos si esa distancia es menor o igual que eps. Por ejemplo, con eps=0,5, una distancia de 0,4 los incluye en la misma vecindad; una de 0,6 los deja fuera [2].</w:t>
+      </w:r>
+    </w:p>
+    <w:p>
+      <w:pPr/>
+      <w:r>
+        <w:t>Un alumno es núcleo si su vecindad contiene al menos min_samples puntos, incluido él mismo. DBSCAN conecta núcleos vecinos y añade como borde a los alumnos cercanos a un núcleo que no alcanzan esa densidad mínima; los que no pertenecen a esas regiones quedan como ruido. Dos alumnos pueden integrar el mismo grupo mediante una cadena de núcleos, aunque no sean vecinos directos. Todo se calcula en diez dimensiones; PCA resume los puntos en dos ejes únicamente para dibujar las figuras [1, 2].</w:t>
+      </w:r>
+    </w:p>
+    <w:p>
       <w:r>
         <w:br w:type="page"/>
       </w:r>
@@ -490,45 +516,48 @@
         <w:pStyle w:val="Heading1"/>
       </w:pPr>
       <w:r>
-        <w:t>4 Interpretación de los resultados</w:t>
+        <w:t>5 Interpretación de los resultados</w:t>
       </w:r>
     </w:p>
     <w:p>
       <w:r>
-        <w:t>Los resultados son compatibles con una región extensa de alumnos conectados por similitudes locales en los atributos académicos. DBSCAN mantiene juntas esas cadenas de vecinos, aunque otros métodos dividan la región en perfiles diferentes. En el caso de siete grupos con poco ruido, el grupo de 2.215 alumnos mezcló integrantes de cinco grupos jerárquicos. Esto muestra que tener siete etiquetas no equivale a obtener siete perfiles académicos comparables [3].</w:t>
+        <w:t>El grupo gigante refleja continuidad por densidad, no un único perfil académico. DBSCAN conecta núcleos vecinos en los diez atributos estandarizados; los extremos de una cadena pueden ser muy diferentes y pertenecer al mismo grupo. Por eso puede reunir perfiles que otros métodos separan: el grupo de 2.215 alumnos mezcló integrantes de cinco grupos jerárquicos. No medimos cuántas regiones internas lo sostienen [1, 2, 3].</w:t>
+      </w:r>
+    </w:p>
+    <w:p>
+      <w:pPr/>
+      <w:r>
+        <w:t>Al reducir eps, algunas conexiones se rompen y la región se fragmenta; otros alumnos pierden densidad o cercanía a un núcleo y pasan a ruido. Aumentar min_samples también puede eliminar regiones pequeñas. El ruido expresa falta de conexión suficiente, no un perfil común ni errores en los datos. Los grupos muy pequeños son posibles porque min_samples exige vecinos para un núcleo, no un tamaño mínimo del grupo final [1, 2].</w:t>
       </w:r>
     </w:p>
     <w:p>
       <w:r>
-        <w:t>Al reducir eps se vuelve más exigente la cercanía necesaria para conectar alumnos. Algunas regiones se separan, pero otros puntos pierden suficientes vecinos y pasan a ruido. Aumentar min_samples también exige mayor densidad y puede eliminar grupos pequeños. La cantidad de grupos no cambia de forma necesariamente monótona: puede crecer por fragmentación o disminuir porque grupos enteros dejan de cumplir el requisito [1, 2].</w:t>
+        <w:t>Las pruebas muestran el costo de separar esa región. De las 470 configuraciones, ocho obtuvieron siete grupos con hasta 15 % de ruido, pero el mayor concentró al menos 94,54 % de los agrupados. En el candidato 1,175/4, cambios pequeños produjeron seis, once o tres grupos. El caso de 59 grupos alcanzó Silhouette de 0,4823, pero evaluó sólo 1.401 de los 2.587 alumnos: una mayor puntuación coexistió con fragmentación y exclusión. Silhouette no basta para valorar la utilidad de los perfiles [1, 3].</w:t>
       </w:r>
     </w:p>
     <w:p>
+      <w:pPr/>
       <w:r>
-        <w:t>En nuestra entrada, la búsqueda no encontró una combinación convincente de cobertura amplia, varios grupos de tamaño relevante y menor concentración. De las 470 configuraciones de la grilla, ocho produjeron siete grupos con hasta 15 % de ruido; en todas, el grupo mayor concentró al menos 94,54 % de los agrupados. En el candidato 1,175/4, subir eps a 1,2 redujo los grupos a seis; cambiar el mínimo a tres o cinco produjo once o tres grupos, respectivamente [3].</w:t>
-      </w:r>
-    </w:p>
-    <w:p>
-      <w:r>
-        <w:t>Silhouette tampoco bastó para elegir una solución: el caso de 59 grupos alcanzó 0,4823, pero evaluó solo 1.401 de los 2.587 alumnos. La mejor puntuación coexistió con ruido elevado y fragmentación. Además, esta medida favorece grupos compactos y no representa por sí sola la utilidad de una segmentación por densidad [1]. No exigimos grupos iguales ni una copia del jerárquico; buscamos perfiles interpretables con cobertura y sensibilidad aceptables.</w:t>
+        <w:t>No encontramos una combinación convincente de cobertura, perfiles relevantes y sensibilidad aceptable. Retirar deserto no cambió las asignaciones ni el ruido en las cinco configuraciones probadas; eso no identifica qué otros atributos sostienen las conexiones. Descomponer las distancias y examinar las cadenas permitiría orientar cambios de atributos o pesos, pero ese análisis no se realizó. La conclusión se limita al protocolo estudiado [3].</w:t>
       </w:r>
     </w:p>
     <w:p>
       <w:pPr>
         <w:pStyle w:val="Heading1"/>
+        <w:pageBreakBefore w:val="0"/>
       </w:pPr>
       <w:r>
-        <w:t>5 Conclusión sobre la incorporación de DBSCAN</w:t>
+        <w:t>6 Conclusión sobre la incorporación de DBSCAN</w:t>
       </w:r>
     </w:p>
     <w:p>
       <w:r>
-        <w:t>Decidimos no adoptar DBSCAN como método seleccionado para la segmentación académica de este trabajo. Bajo la entrada común, la distancia y las configuraciones evaluadas, sus resultados no aportaron una separación suficientemente útil de varios perfiles: las soluciones de mayor cobertura concentraron a los alumnos en un grupo dominante, y las más fragmentadas excluyeron una parte importante de la población.</w:t>
+        <w:t>Decidimos no adoptar DBSCAN como segmentación académica seleccionada bajo la entrada, distancia y configuraciones evaluadas. Su criterio de conexión reúne perfiles diversos en una región dominante; al exigir mayor separación, aumentan la fragmentación y el ruido. Las soluciones obtenidas no ofrecieron el equilibrio buscado entre perfiles interpretables, cobertura y sensibilidad.</w:t>
       </w:r>
     </w:p>
     <w:p>
       <w:r>
-        <w:t>Esta conclusión se limita al protocolo estudiado. DBSCAN no garantiza una partición adecuada para cualquier conjunto de datos, y nuestras pruebas no demuestran una imposibilidad general ni que los estudiantes carezcan de otros agrupamientos. Cerramos la búsqueda de parámetros y conservamos la implementación, los casos fijos y sus gráficos como evidencia experimental. La decisión corresponde a su uso como segmentación elegida, no a retirar el registro de lo realizado.</w:t>
+        <w:t>Este resultado no demuestra que exista un único perfil ni que DBSCAN sea inadecuado en general. Cambiar atributos, pesos o distancia podría modificar la estructura, pero requeriría otro experimento. Cerramos la búsqueda de parámetros del protocolo actual y conservamos la implementación, los casos fijos y sus gráficos como evidencia.</w:t>
       </w:r>
     </w:p>
     <w:p>
@@ -573,7 +602,7 @@
         <w:rPr>
           <w:sz w:val="18"/>
         </w:rPr>
-        <w:t>[3] Registros del proyecto: concordancia-dbscan.md y ampliacion-dbscan.md, en docs/resultados; src/clustering/dbscan.py. Casos recalculados para verificar este documento el 10 de octubre de 2026.</w:t>
+        <w:t>[3] Registros del proyecto: docs/resultados/anexo-tecnico-dbscan.md; src/methods/dbscan.py. Casos recalculados para verificar este documento el 10 de octubre de 2026.</w:t>
       </w:r>
     </w:p>
     <w:sectPr>

</xml_diff>